<commit_message>
chore(examples): align trio outputs and fix textbox schema usage
- Rename every script's output to match its name-aligned trio
  (formulas.sh→formulas.docx, charts.sh→charts.xlsx, etc.) and
  use $(dirname "$0") so outputs always land next to the script
  regardless of caller CWD.
- tables.sh produces a 3-format demo so its xlsx/pptx are renamed to
  tables.{xlsx,pptx} alongside tables.docx.
- 3d-model.sh: fix nonexistent outputs/ subpath.
- textbox.sh: append paragraphs via "//w:body/w:sectPr"+insertbefore
  instead of "//w:body"+append, since w:sectPr must be the last
  child of w:body. Final document now validates clean.
- Add missing numbering-showcase.md stub to complete the trio.
- Refresh README.md to match real script names and current help-command
  syntax (officecli help <fmt> ...).
</commit_message>
<xml_diff>
--- a/examples/word/formulas.docx
+++ b/examples/word/formulas.docx
@@ -1,6 +1,6 @@
 
 <file path=word/document.xml><?xml version="1.0" encoding="utf-8"?>
-<w:document xmlns:w="http://schemas.openxmlformats.org/wordprocessingml/2006/main">
+<w:document xmlns:m="http://schemas.openxmlformats.org/officeDocument/2006/math" xmlns:w="http://schemas.openxmlformats.org/wordprocessingml/2006/main" xmlns:mc="http://schemas.openxmlformats.org/markup-compatibility/2006" xmlns:w14="http://schemas.microsoft.com/office/word/2010/wordml" mc:Ignorable="w14">
   <w:body>
     <w:p>
       <w:pPr>
@@ -2449,6 +2449,28 @@
         </m:oMath>
       </m:oMathPara>
     </w:p>
+    <w:sectPr>
+      <w:pgSz w:w="11906" w:h="16838"/>
+      <w:pgMar w:top="1440" w:right="1800" w:bottom="1440" w:left="1800"/>
+      <w:docGrid w:type="default"/>
+    </w:sectPr>
   </w:body>
 </w:document>
+</file>
+
+<file path=word/numbering.xml><?xml version="1.0" encoding="utf-8"?>
+<w:numbering xmlns:w="http://schemas.openxmlformats.org/wordprocessingml/2006/main"/>
+</file>
+
+<file path=word/styles.xml><?xml version="1.0" encoding="utf-8"?>
+<w:styles xmlns:w="http://schemas.openxmlformats.org/wordprocessingml/2006/main">
+  <w:docDefaults>
+    <w:rPrDefault>
+      <w:rPr>
+        <w:rFonts w:ascii="Times New Roman" w:hAnsi="Times New Roman"/>
+      </w:rPr>
+    </w:rPrDefault>
+    <w:pPrDefault/>
+  </w:docDefaults>
+</w:styles>
 </file>
</xml_diff>